<commit_message>
3rd week of feb work
</commit_message>
<xml_diff>
--- a/writing/2025-01-27_methods.docx
+++ b/writing/2025-01-27_methods.docx
@@ -3800,13 +3800,32 @@
       </w:r>
     </w:p>
     <w:p/>
+    <w:p>
+      <w:r>
+        <w:t xml:space="preserve">Remember that after you ran </w:t>
+      </w:r>
+      <w:proofErr w:type="spellStart"/>
+      <w:r>
+        <w:t>kneaddata</w:t>
+      </w:r>
+      <w:proofErr w:type="spellEnd"/>
+      <w:r>
+        <w:t xml:space="preserve"> you </w:t>
+      </w:r>
+      <w:proofErr w:type="spellStart"/>
+      <w:r>
+        <w:t>contatenated</w:t>
+      </w:r>
+      <w:proofErr w:type="spellEnd"/>
+      <w:r>
+        <w:t xml:space="preserve"> the forward and reverse files</w:t>
+      </w:r>
+    </w:p>
+    <w:p/>
     <w:p/>
     <w:p>
       <w:r>
-        <w:t>used HUMAnN3 (v)</w:t>
-      </w:r>
-      <w:r>
-        <w:t xml:space="preserve"> for functional profiling</w:t>
+        <w:t>used HUMAnN3 (v) for functional profiling</w:t>
       </w:r>
     </w:p>
     <w:p/>

</xml_diff>

<commit_message>
week of 2025-03-18 writing updates
</commit_message>
<xml_diff>
--- a/writing/2025-01-27_methods.docx
+++ b/writing/2025-01-27_methods.docx
@@ -3161,7 +3161,13 @@
       </w:r>
       <w:r>
         <w:lastRenderedPageBreak/>
-        <w:t xml:space="preserve">temperature as a predictor to our model improved model fit beyond accounting for known predictors of microbiome composition (i.e., sex, social group, diet, and seasonality). We found that the model that included temperature accounted for 100% of the model weight for all community features, except for principal coordinate 4 where it accounted for 90% of the model weight (table s). Both alpha diversity indices showed a reliable, negative relationship with temperature (Shannon </w:t>
+        <w:t>temperature as a predictor to our model improved model fit beyond accounting for known predictors of microbiome composition (i.e., sex, social group, diet, and seasonality). We found that the model that included temperature accounted for 100% of the model weight for all community features, except for principal coordinate 4</w:t>
+      </w:r>
+      <w:r>
+        <w:t>,</w:t>
+      </w:r>
+      <w:r>
+        <w:t xml:space="preserve"> where it accounted for 90% of the model weight (table s). Both alpha diversity indices showed a reliable, negative relationship with temperature (Shannon </w:t>
       </w:r>
       <w:r>
         <w:t>β</w:t>
@@ -3799,16 +3805,7 @@
         <w:t xml:space="preserve"> concatenated the forward and reverse reads </w:t>
       </w:r>
       <w:r>
-        <w:t xml:space="preserve">and used </w:t>
-      </w:r>
-      <w:r>
-        <w:t>HUMAnN3 (v</w:t>
-      </w:r>
-      <w:r>
-        <w:t>3.9</w:t>
-      </w:r>
-      <w:r>
-        <w:t>)</w:t>
+        <w:t>and used HUMAnN3 (v3.9)</w:t>
       </w:r>
       <w:r>
         <w:t xml:space="preserve"> </w:t>

</xml_diff>